<commit_message>
worked on updating list generator and implementing the spell checker suggestion generator
</commit_message>
<xml_diff>
--- a/project_writeup/Useful reports for project.docx
+++ b/project_writeup/Useful reports for project.docx
@@ -214,6 +214,30 @@
       <w:r>
         <w:t>Discuss other possible actions that could be taken around possible machine learning methods (if possible in time)</w:t>
       </w:r>
+    </w:p>
+    <w:p>
+      <w:pPr>
+        <w:pStyle w:val="ListParagraph"/>
+        <w:numPr>
+          <w:ilvl w:val="0"/>
+          <w:numId w:val="2"/>
+        </w:numPr>
+      </w:pPr>
+      <w:r>
+        <w:t xml:space="preserve">Talk about possible </w:t>
+      </w:r>
+      <w:r>
+        <w:t>parallelisation. Yes</w:t>
+      </w:r>
+    </w:p>
+    <w:p>
+      <w:pPr>
+        <w:pStyle w:val="ListParagraph"/>
+        <w:numPr>
+          <w:ilvl w:val="0"/>
+          <w:numId w:val="2"/>
+        </w:numPr>
+      </w:pPr>
     </w:p>
     <w:sectPr>
       <w:pgSz w:w="11906" w:h="16838"/>

</xml_diff>